<commit_message>
Add PA2 brief and sample, move PA2 to week 7, fix schedule
</commit_message>
<xml_diff>
--- a/course-info/course-curriculum.docx
+++ b/course-info/course-curriculum.docx
@@ -1268,7 +1268,7 @@
           </w:tcPr>
           <w:p>
             <w:r>
-              <w:t>Containers, Mid-term Review</w:t>
+              <w:t>Mid-term Review</w:t>
             </w:r>
           </w:p>
         </w:tc>
@@ -1285,7 +1285,7 @@
           </w:tcPr>
           <w:p>
             <w:r>
-              <w:t>Lab: Docker Containers (2%)</w:t>
+              <w:t>Mid-term, Practical Assessment 2: Fleet Compliance Auditor (5%)</w:t>
             </w:r>
             <w:r/>
             <w:r/>
@@ -1303,7 +1303,6 @@
         <w:tc>
           <w:tcPr>
             <w:tcW w:w="1008" w:type="dxa"/>
-            <w:shd w:val="clear" w:color="auto" w:fill="F7F8F9"/>
             <w:tcMar>
               <w:top w:w="60" w:type="dxa"/>
               <w:left w:w="100" w:type="dxa"/>
@@ -1331,37 +1330,33 @@
         <w:tc>
           <w:tcPr>
             <w:tcW w:w="4232" w:type="dxa"/>
-            <w:shd w:val="clear" w:color="auto" w:fill="F7F8F9"/>
-            <w:tcMar>
-              <w:top w:w="60" w:type="dxa"/>
-              <w:left w:w="100" w:type="dxa"/>
-              <w:bottom w:w="60" w:type="dxa"/>
-              <w:right w:w="100" w:type="dxa"/>
-            </w:tcMar>
-            <w:vAlign w:val="center"/>
-          </w:tcPr>
-          <w:p>
-            <w:r>
-              <w:t>Mid-term</w:t>
+            <w:tcMar>
+              <w:top w:w="60" w:type="dxa"/>
+              <w:left w:w="100" w:type="dxa"/>
+              <w:bottom w:w="60" w:type="dxa"/>
+              <w:right w:w="100" w:type="dxa"/>
+            </w:tcMar>
+            <w:vAlign w:val="center"/>
+          </w:tcPr>
+          <w:p>
+            <w:r>
+              <w:t>Study Break</w:t>
             </w:r>
           </w:p>
         </w:tc>
         <w:tc>
           <w:tcPr>
             <w:tcW w:w="4840" w:type="dxa"/>
-            <w:shd w:val="clear" w:color="auto" w:fill="F7F8F9"/>
-            <w:tcMar>
-              <w:top w:w="60" w:type="dxa"/>
-              <w:left w:w="100" w:type="dxa"/>
-              <w:bottom w:w="60" w:type="dxa"/>
-              <w:right w:w="100" w:type="dxa"/>
-            </w:tcMar>
-            <w:vAlign w:val="center"/>
-          </w:tcPr>
-          <w:p>
-            <w:r>
-              <w:t>Practical Assessment 2: Containerized Python App (5%)</w:t>
-            </w:r>
+            <w:tcMar>
+              <w:top w:w="60" w:type="dxa"/>
+              <w:left w:w="100" w:type="dxa"/>
+              <w:bottom w:w="60" w:type="dxa"/>
+              <w:right w:w="100" w:type="dxa"/>
+            </w:tcMar>
+            <w:vAlign w:val="center"/>
+          </w:tcPr>
+          <w:p>
+            <w:r/>
           </w:p>
         </w:tc>
       </w:tr>
@@ -1375,6 +1370,7 @@
         <w:tc>
           <w:tcPr>
             <w:tcW w:w="1008" w:type="dxa"/>
+            <w:shd w:val="clear" w:color="auto" w:fill="F7F8F9"/>
             <w:tcMar>
               <w:top w:w="60" w:type="dxa"/>
               <w:left w:w="100" w:type="dxa"/>
@@ -1402,33 +1398,37 @@
         <w:tc>
           <w:tcPr>
             <w:tcW w:w="4232" w:type="dxa"/>
-            <w:tcMar>
-              <w:top w:w="60" w:type="dxa"/>
-              <w:left w:w="100" w:type="dxa"/>
-              <w:bottom w:w="60" w:type="dxa"/>
-              <w:right w:w="100" w:type="dxa"/>
-            </w:tcMar>
-            <w:vAlign w:val="center"/>
-          </w:tcPr>
-          <w:p>
-            <w:r>
-              <w:t>Study Break</w:t>
+            <w:shd w:val="clear" w:color="auto" w:fill="F7F8F9"/>
+            <w:tcMar>
+              <w:top w:w="60" w:type="dxa"/>
+              <w:left w:w="100" w:type="dxa"/>
+              <w:bottom w:w="60" w:type="dxa"/>
+              <w:right w:w="100" w:type="dxa"/>
+            </w:tcMar>
+            <w:vAlign w:val="center"/>
+          </w:tcPr>
+          <w:p>
+            <w:r>
+              <w:t>Containers</w:t>
             </w:r>
           </w:p>
         </w:tc>
         <w:tc>
           <w:tcPr>
             <w:tcW w:w="4840" w:type="dxa"/>
-            <w:tcMar>
-              <w:top w:w="60" w:type="dxa"/>
-              <w:left w:w="100" w:type="dxa"/>
-              <w:bottom w:w="60" w:type="dxa"/>
-              <w:right w:w="100" w:type="dxa"/>
-            </w:tcMar>
-            <w:vAlign w:val="center"/>
-          </w:tcPr>
-          <w:p>
-            <w:r/>
+            <w:shd w:val="clear" w:color="auto" w:fill="F7F8F9"/>
+            <w:tcMar>
+              <w:top w:w="60" w:type="dxa"/>
+              <w:left w:w="100" w:type="dxa"/>
+              <w:bottom w:w="60" w:type="dxa"/>
+              <w:right w:w="100" w:type="dxa"/>
+            </w:tcMar>
+            <w:vAlign w:val="center"/>
+          </w:tcPr>
+          <w:p>
+            <w:r>
+              <w:t>Lab: Docker Containers (2%)</w:t>
+            </w:r>
           </w:p>
         </w:tc>
       </w:tr>

</xml_diff>

<commit_message>
Fix week 6 and 7 labels in README and curriculum
</commit_message>
<xml_diff>
--- a/course-info/course-curriculum.docx
+++ b/course-info/course-curriculum.docx
@@ -1194,7 +1194,7 @@
           </w:tcPr>
           <w:p>
             <w:r>
-              <w:t>Version Control</w:t>
+              <w:t>Version Control + Mid-term Review</w:t>
             </w:r>
             <w:r/>
             <w:r/>
@@ -1268,7 +1268,7 @@
           </w:tcPr>
           <w:p>
             <w:r>
-              <w:t>Mid-term Review</w:t>
+              <w:t>Mid-term</w:t>
             </w:r>
           </w:p>
         </w:tc>

</xml_diff>

<commit_message>
Fix curriculum labels and trailing blank page
</commit_message>
<xml_diff>
--- a/course-info/course-curriculum.docx
+++ b/course-info/course-curriculum.docx
@@ -1869,7 +1869,15 @@
         </w:tc>
       </w:tr>
     </w:tbl>
-    <w:p/>
+    <w:p>
+      <w:pPr>
+        <w:spacing w:before="0" w:after="0" w:line="20" w:lineRule="exact"/>
+        <w:rPr>
+          <w:sz w:val="2"/>
+          <w:szCs w:val="2"/>
+        </w:rPr>
+      </w:pPr>
+    </w:p>
     <w:sectPr>
       <w:pgSz w:w="12240" w:h="15840"/>
       <w:pgMar w:top="1080" w:right="1080" w:bottom="1080" w:left="1080" w:header="708" w:footer="708" w:gutter="0"/>

</xml_diff>